<commit_message>
Prepare interview validation, template labels, and development review
</commit_message>
<xml_diff>
--- a/docassemble/ForeclosureSalePostponement/data/templates/foreclosure_sale_postponement_next_steps.docx
+++ b/docassemble/ForeclosureSalePostponement/data/templates/foreclosure_sale_postponement_next_steps.docx
@@ -54,7 +54,7 @@
       </w:r>
       <w:proofErr w:type="gramStart"/>
       <w:r>
-        <w:t xml:space="preserve">_{ users</w:t>
+        <w:t>{ users</w:t>
       </w:r>
       <w:proofErr w:type="gramEnd"/>
       <w:r>
@@ -70,6 +70,11 @@
       <w:pPr>
         <w:sectPr>
           <w:footerReference w:type="first" r:id="rId7"/>
+          <w:headerReference w:type="default" r:id="rId10"/>
+          <w:headerReference w:type="first" r:id="rId11"/>
+          <w:headerReference w:type="even" r:id="rId12"/>
+          <w:footerReference w:type="default" r:id="rId13"/>
+          <w:footerReference w:type="even" r:id="rId14"/>
           <w:pgSz w:w="12240" w:h="15840"/>
           <w:pgMar w:top="720" w:right="720" w:bottom="720" w:left="720" w:header="0" w:footer="0" w:gutter="0"/>
           <w:pgNumType w:start="1"/>
@@ -135,7 +140,7 @@
             <w14:bevel/>
           </w14:textOutline>
         </w:rPr>
-        <w:t xml:space="preserve">_{ </w:t>
+        <w:t xml:space="preserve">{ </w:t>
       </w:r>
       <w:proofErr w:type="spellStart"/>
       <w:r>
@@ -257,7 +262,7 @@
             <w14:bevel/>
           </w14:textOutline>
         </w:rPr>
-        <w:t xml:space="preserve">_{ </w:t>
+        <w:t xml:space="preserve">{ </w:t>
       </w:r>
       <w:proofErr w:type="spellStart"/>
       <w:r>
@@ -358,7 +363,7 @@
             <w14:bevel/>
           </w14:textOutline>
         </w:rPr>
-        <w:t xml:space="preserve">_{ </w:t>
+        <w:t xml:space="preserve">{ </w:t>
       </w:r>
       <w:proofErr w:type="spellStart"/>
       <w:r>
@@ -417,7 +422,7 @@
             <w14:bevel/>
           </w14:textOutline>
         </w:rPr>
-        <w:t xml:space="preserve">_{ </w:t>
+        <w:t xml:space="preserve">{ </w:t>
       </w:r>
       <w:proofErr w:type="spellStart"/>
       <w:r>
@@ -520,7 +525,7 @@
             <w14:bevel/>
           </w14:textOutline>
         </w:rPr>
-        <w:t xml:space="preserve">_{ </w:t>
+        <w:t xml:space="preserve">{ </w:t>
       </w:r>
       <w:proofErr w:type="spellStart"/>
       <w:r>
@@ -843,6 +848,26 @@
 </w:ftr>
 </file>
 
+<file path=word/footer2.xml><?xml version="1.0" encoding="utf-8"?>
+<w:ftr xmlns:m="http://schemas.openxmlformats.org/officeDocument/2006/math" xmlns:mc="http://schemas.openxmlformats.org/markup-compatibility/2006" xmlns:mo="http://schemas.microsoft.com/office/mac/office/2008/main" xmlns:mv="urn:schemas-microsoft-com:mac:vml" xmlns:o="urn:schemas-microsoft-com:office:office" xmlns:r="http://schemas.openxmlformats.org/officeDocument/2006/relationships" xmlns:v="urn:schemas-microsoft-com:vml" xmlns:w10="urn:schemas-microsoft-com:office:word" xmlns:w14="http://schemas.microsoft.com/office/word/2010/wordml" xmlns:w="http://schemas.openxmlformats.org/wordprocessingml/2006/main" xmlns:wne="http://schemas.microsoft.com/office/word/2006/wordml" xmlns:wp14="http://schemas.microsoft.com/office/word/2010/wordprocessingDrawing" xmlns:wp="http://schemas.openxmlformats.org/drawingml/2006/wordprocessingDrawing" xmlns:wpc="http://schemas.microsoft.com/office/word/2010/wordprocessingCanvas" xmlns:wpg="http://schemas.microsoft.com/office/word/2010/wordprocessingGroup" xmlns:wpi="http://schemas.microsoft.com/office/word/2010/wordprocessingInk" xmlns:wps="http://schemas.microsoft.com/office/word/2010/wordprocessingShape" mc:Ignorable="w14 wp14">
+  <w:p>
+    <w:pPr>
+      <w:pStyle w:val="Footer"/>
+    </w:pPr>
+  </w:p>
+</w:ftr>
+</file>
+
+<file path=word/footer3.xml><?xml version="1.0" encoding="utf-8"?>
+<w:ftr xmlns:m="http://schemas.openxmlformats.org/officeDocument/2006/math" xmlns:mc="http://schemas.openxmlformats.org/markup-compatibility/2006" xmlns:mo="http://schemas.microsoft.com/office/mac/office/2008/main" xmlns:mv="urn:schemas-microsoft-com:mac:vml" xmlns:o="urn:schemas-microsoft-com:office:office" xmlns:r="http://schemas.openxmlformats.org/officeDocument/2006/relationships" xmlns:v="urn:schemas-microsoft-com:vml" xmlns:w10="urn:schemas-microsoft-com:office:word" xmlns:w14="http://schemas.microsoft.com/office/word/2010/wordml" xmlns:w="http://schemas.openxmlformats.org/wordprocessingml/2006/main" xmlns:wne="http://schemas.microsoft.com/office/word/2006/wordml" xmlns:wp14="http://schemas.microsoft.com/office/word/2010/wordprocessingDrawing" xmlns:wp="http://schemas.openxmlformats.org/drawingml/2006/wordprocessingDrawing" xmlns:wpc="http://schemas.microsoft.com/office/word/2010/wordprocessingCanvas" xmlns:wpg="http://schemas.microsoft.com/office/word/2010/wordprocessingGroup" xmlns:wpi="http://schemas.microsoft.com/office/word/2010/wordprocessingInk" xmlns:wps="http://schemas.microsoft.com/office/word/2010/wordprocessingShape" mc:Ignorable="w14 wp14">
+  <w:p>
+    <w:pPr>
+      <w:pStyle w:val="Footer"/>
+    </w:pPr>
+  </w:p>
+</w:ftr>
+</file>
+
 <file path=word/footnotes.xml><?xml version="1.0" encoding="utf-8"?>
 <w:footnotes xmlns:wpc="http://schemas.microsoft.com/office/word/2010/wordprocessingCanvas" xmlns:cx="http://schemas.microsoft.com/office/drawing/2014/chartex" xmlns:cx1="http://schemas.microsoft.com/office/drawing/2015/9/8/chartex" xmlns:cx2="http://schemas.microsoft.com/office/drawing/2015/10/21/chartex" xmlns:cx3="http://schemas.microsoft.com/office/drawing/2016/5/9/chartex" xmlns:cx4="http://schemas.microsoft.com/office/drawing/2016/5/10/chartex" xmlns:cx5="http://schemas.microsoft.com/office/drawing/2016/5/11/chartex" xmlns:cx6="http://schemas.microsoft.com/office/drawing/2016/5/12/chartex" xmlns:cx7="http://schemas.microsoft.com/office/drawing/2016/5/13/chartex" xmlns:cx8="http://schemas.microsoft.com/office/drawing/2016/5/14/chartex" xmlns:mc="http://schemas.openxmlformats.org/markup-compatibility/2006" xmlns:aink="http://schemas.microsoft.com/office/drawing/2016/ink" xmlns:am3d="http://schemas.microsoft.com/office/drawing/2017/model3d" xmlns:o="urn:schemas-microsoft-com:office:office" xmlns:r="http://schemas.openxmlformats.org/officeDocument/2006/relationships" xmlns:m="http://schemas.openxmlformats.org/officeDocument/2006/math" xmlns:v="urn:schemas-microsoft-com:vml" xmlns:wp14="http://schemas.microsoft.com/office/word/2010/wordprocessingDrawing" xmlns:wp="http://schemas.openxmlformats.org/drawingml/2006/wordprocessingDrawing" xmlns:w10="urn:schemas-microsoft-com:office:word" xmlns:w="http://schemas.openxmlformats.org/wordprocessingml/2006/main" xmlns:w14="http://schemas.microsoft.com/office/word/2010/wordml" xmlns:w15="http://schemas.microsoft.com/office/word/2012/wordml" xmlns:w16cid="http://schemas.microsoft.com/office/word/2016/wordml/cid" xmlns:w16se="http://schemas.microsoft.com/office/word/2015/wordml/symex" xmlns:wpg="http://schemas.microsoft.com/office/word/2010/wordprocessingGroup" xmlns:wpi="http://schemas.microsoft.com/office/word/2010/wordprocessingInk" xmlns:wne="http://schemas.microsoft.com/office/word/2006/wordml" xmlns:wps="http://schemas.microsoft.com/office/word/2010/wordprocessingShape" mc:Ignorable="w14 w15 w16se w16cid wp14">
   <w:footnote w:type="separator" w:id="-1">
@@ -866,6 +891,36 @@
     </w:p>
   </w:footnote>
 </w:footnotes>
+</file>
+
+<file path=word/header1.xml><?xml version="1.0" encoding="utf-8"?>
+<w:hdr xmlns:m="http://schemas.openxmlformats.org/officeDocument/2006/math" xmlns:mc="http://schemas.openxmlformats.org/markup-compatibility/2006" xmlns:mo="http://schemas.microsoft.com/office/mac/office/2008/main" xmlns:mv="urn:schemas-microsoft-com:mac:vml" xmlns:o="urn:schemas-microsoft-com:office:office" xmlns:r="http://schemas.openxmlformats.org/officeDocument/2006/relationships" xmlns:v="urn:schemas-microsoft-com:vml" xmlns:w10="urn:schemas-microsoft-com:office:word" xmlns:w14="http://schemas.microsoft.com/office/word/2010/wordml" xmlns:w="http://schemas.openxmlformats.org/wordprocessingml/2006/main" xmlns:wne="http://schemas.microsoft.com/office/word/2006/wordml" xmlns:wp14="http://schemas.microsoft.com/office/word/2010/wordprocessingDrawing" xmlns:wp="http://schemas.openxmlformats.org/drawingml/2006/wordprocessingDrawing" xmlns:wpc="http://schemas.microsoft.com/office/word/2010/wordprocessingCanvas" xmlns:wpg="http://schemas.microsoft.com/office/word/2010/wordprocessingGroup" xmlns:wpi="http://schemas.microsoft.com/office/word/2010/wordprocessingInk" xmlns:wps="http://schemas.microsoft.com/office/word/2010/wordprocessingShape" mc:Ignorable="w14 wp14">
+  <w:p>
+    <w:pPr>
+      <w:pStyle w:val="Header"/>
+    </w:pPr>
+  </w:p>
+</w:hdr>
+</file>
+
+<file path=word/header2.xml><?xml version="1.0" encoding="utf-8"?>
+<w:hdr xmlns:m="http://schemas.openxmlformats.org/officeDocument/2006/math" xmlns:mc="http://schemas.openxmlformats.org/markup-compatibility/2006" xmlns:mo="http://schemas.microsoft.com/office/mac/office/2008/main" xmlns:mv="urn:schemas-microsoft-com:mac:vml" xmlns:o="urn:schemas-microsoft-com:office:office" xmlns:r="http://schemas.openxmlformats.org/officeDocument/2006/relationships" xmlns:v="urn:schemas-microsoft-com:vml" xmlns:w10="urn:schemas-microsoft-com:office:word" xmlns:w14="http://schemas.microsoft.com/office/word/2010/wordml" xmlns:w="http://schemas.openxmlformats.org/wordprocessingml/2006/main" xmlns:wne="http://schemas.microsoft.com/office/word/2006/wordml" xmlns:wp14="http://schemas.microsoft.com/office/word/2010/wordprocessingDrawing" xmlns:wp="http://schemas.openxmlformats.org/drawingml/2006/wordprocessingDrawing" xmlns:wpc="http://schemas.microsoft.com/office/word/2010/wordprocessingCanvas" xmlns:wpg="http://schemas.microsoft.com/office/word/2010/wordprocessingGroup" xmlns:wpi="http://schemas.microsoft.com/office/word/2010/wordprocessingInk" xmlns:wps="http://schemas.microsoft.com/office/word/2010/wordprocessingShape" mc:Ignorable="w14 wp14">
+  <w:p>
+    <w:pPr>
+      <w:pStyle w:val="Header"/>
+    </w:pPr>
+  </w:p>
+</w:hdr>
+</file>
+
+<file path=word/header3.xml><?xml version="1.0" encoding="utf-8"?>
+<w:hdr xmlns:m="http://schemas.openxmlformats.org/officeDocument/2006/math" xmlns:mc="http://schemas.openxmlformats.org/markup-compatibility/2006" xmlns:mo="http://schemas.microsoft.com/office/mac/office/2008/main" xmlns:mv="urn:schemas-microsoft-com:mac:vml" xmlns:o="urn:schemas-microsoft-com:office:office" xmlns:r="http://schemas.openxmlformats.org/officeDocument/2006/relationships" xmlns:v="urn:schemas-microsoft-com:vml" xmlns:w10="urn:schemas-microsoft-com:office:word" xmlns:w14="http://schemas.microsoft.com/office/word/2010/wordml" xmlns:w="http://schemas.openxmlformats.org/wordprocessingml/2006/main" xmlns:wne="http://schemas.microsoft.com/office/word/2006/wordml" xmlns:wp14="http://schemas.microsoft.com/office/word/2010/wordprocessingDrawing" xmlns:wp="http://schemas.openxmlformats.org/drawingml/2006/wordprocessingDrawing" xmlns:wpc="http://schemas.microsoft.com/office/word/2010/wordprocessingCanvas" xmlns:wpg="http://schemas.microsoft.com/office/word/2010/wordprocessingGroup" xmlns:wpi="http://schemas.microsoft.com/office/word/2010/wordprocessingInk" xmlns:wps="http://schemas.microsoft.com/office/word/2010/wordprocessingShape" mc:Ignorable="w14 wp14">
+  <w:p>
+    <w:pPr>
+      <w:pStyle w:val="Header"/>
+    </w:pPr>
+  </w:p>
+</w:hdr>
 </file>
 
 <file path=word/numbering.xml><?xml version="1.0" encoding="utf-8"?>

</xml_diff>

<commit_message>
Use Minnesota holidays for filing recommendations and fix redemption display
</commit_message>
<xml_diff>
--- a/docassemble/ForeclosureSalePostponement/data/templates/foreclosure_sale_postponement_next_steps.docx
+++ b/docassemble/ForeclosureSalePostponement/data/templates/foreclosure_sale_postponement_next_steps.docx
@@ -15,6 +15,10 @@
         <w:t>Scheduled sale: {{ sale_date.format() }}</w:t>
         <w:br/>
         <w:t>15 days before the sale: {{ filing_cutoff.format() }}</w:t>
+      </w:r>
+      <w:r>
+        <w:br/>
+        <w:t>Plan to finish recording and delivery by: {{ filing_business_day.format() }}</w:t>
       </w:r>
     </w:p>
     <w:p>
@@ -66,7 +70,7 @@
     </w:p>
     <w:p>
       <w:r>
-        <w:t>The date shown above is 15 calendar days before the sale. This interview does not extend the filing period for weekends or holidays. Finish early enough to complete every recording, filing, and delivery step while the offices are open.</w:t>
+        <w:t>The legal cutoff shown above is 15 calendar days before the sale. The recommended completion date uses Minnesota holidays and weekends to find the last business day on or before that cutoff. Weekends and holidays do not extend the legal cutoff. Confirm office hours and finish earlier if an office will be closed. Allow time to complete every recording, filing, and delivery step.</w:t>
       </w:r>
     </w:p>
     <w:p>

</xml_diff>